<commit_message>
Fixe hébergement et accompagnement 2 ans à 2 000 000 FCFA TTC
Remplace maintenance/hébergement 1 an par une ligne unique sur
deux ans à 2 000 000 FCFA TTC ; total proforma 5 650 000 FCFA.

Co-authored-by: NigerCertify-offensive-lab <openaiabou@gmail.com>
</commit_message>
<xml_diff>
--- a/offres/facture-proforma-ml-consulting.docx
+++ b/offres/facture-proforma-ml-consulting.docx
@@ -77,7 +77,7 @@
             <w:r/>
             <w:r>
               <w:rPr>
-                <w:rFonts w:ascii="Calibri" w:hAnsi="Calibri" w:eastAsia="Calibri"/>
+                <w:rFonts w:ascii="Calibri" w:hAnsi="Calibri"/>
                 <w:b/>
                 <w:i w:val="0"/>
                 <w:color w:val="FF7900"/>
@@ -87,7 +87,7 @@
             </w:r>
             <w:r>
               <w:rPr>
-                <w:rFonts w:ascii="Calibri" w:hAnsi="Calibri" w:eastAsia="Calibri"/>
+                <w:rFonts w:ascii="Calibri" w:hAnsi="Calibri"/>
                 <w:b/>
                 <w:i w:val="0"/>
                 <w:color w:val="0055D2"/>
@@ -102,7 +102,7 @@
             </w:pPr>
             <w:r>
               <w:rPr>
-                <w:rFonts w:ascii="Calibri" w:hAnsi="Calibri" w:eastAsia="Calibri"/>
+                <w:rFonts w:ascii="Calibri" w:hAnsi="Calibri"/>
                 <w:b w:val="0"/>
                 <w:i w:val="0"/>
                 <w:color w:val="00224B"/>
@@ -117,7 +117,7 @@
             </w:pPr>
             <w:r>
               <w:rPr>
-                <w:rFonts w:ascii="Calibri" w:hAnsi="Calibri" w:eastAsia="Calibri"/>
+                <w:rFonts w:ascii="Calibri" w:hAnsi="Calibri"/>
                 <w:b w:val="0"/>
                 <w:i w:val="0"/>
                 <w:color w:val="00224B"/>
@@ -163,7 +163,7 @@
                   <w:r/>
                   <w:r>
                     <w:rPr>
-                      <w:rFonts w:ascii="Calibri" w:hAnsi="Calibri" w:eastAsia="Calibri"/>
+                      <w:rFonts w:ascii="Calibri" w:hAnsi="Calibri"/>
                       <w:b/>
                       <w:i w:val="0"/>
                       <w:color w:val="00224B"/>
@@ -191,7 +191,7 @@
                   <w:r/>
                   <w:r>
                     <w:rPr>
-                      <w:rFonts w:ascii="Calibri" w:hAnsi="Calibri" w:eastAsia="Calibri"/>
+                      <w:rFonts w:ascii="Calibri" w:hAnsi="Calibri"/>
                       <w:b w:val="0"/>
                       <w:i w:val="0"/>
                       <w:color w:val="000000"/>
@@ -214,7 +214,7 @@
                   <w:r/>
                   <w:r>
                     <w:rPr>
-                      <w:rFonts w:ascii="Calibri" w:hAnsi="Calibri" w:eastAsia="Calibri"/>
+                      <w:rFonts w:ascii="Calibri" w:hAnsi="Calibri"/>
                       <w:b/>
                       <w:i w:val="0"/>
                       <w:color w:val="00224B"/>
@@ -242,7 +242,7 @@
                   <w:r/>
                   <w:r>
                     <w:rPr>
-                      <w:rFonts w:ascii="Calibri" w:hAnsi="Calibri" w:eastAsia="Calibri"/>
+                      <w:rFonts w:ascii="Calibri" w:hAnsi="Calibri"/>
                       <w:b w:val="0"/>
                       <w:i w:val="0"/>
                       <w:color w:val="000000"/>
@@ -265,7 +265,7 @@
                   <w:r/>
                   <w:r>
                     <w:rPr>
-                      <w:rFonts w:ascii="Calibri" w:hAnsi="Calibri" w:eastAsia="Calibri"/>
+                      <w:rFonts w:ascii="Calibri" w:hAnsi="Calibri"/>
                       <w:b/>
                       <w:i w:val="0"/>
                       <w:color w:val="00224B"/>
@@ -293,7 +293,7 @@
                   <w:r/>
                   <w:r>
                     <w:rPr>
-                      <w:rFonts w:ascii="Calibri" w:hAnsi="Calibri" w:eastAsia="Calibri"/>
+                      <w:rFonts w:ascii="Calibri" w:hAnsi="Calibri"/>
                       <w:b w:val="0"/>
                       <w:i w:val="0"/>
                       <w:color w:val="000000"/>
@@ -343,7 +343,7 @@
             <w:r/>
             <w:r>
               <w:rPr>
-                <w:rFonts w:ascii="Calibri" w:hAnsi="Calibri" w:eastAsia="Calibri"/>
+                <w:rFonts w:ascii="Calibri" w:hAnsi="Calibri"/>
                 <w:b/>
                 <w:i w:val="0"/>
                 <w:color w:val="00224B"/>
@@ -371,7 +371,7 @@
             <w:r/>
             <w:r>
               <w:rPr>
-                <w:rFonts w:ascii="Calibri" w:hAnsi="Calibri" w:eastAsia="Calibri"/>
+                <w:rFonts w:ascii="Calibri" w:hAnsi="Calibri"/>
                 <w:b w:val="0"/>
                 <w:i w:val="0"/>
                 <w:color w:val="000000"/>
@@ -394,7 +394,7 @@
             <w:r/>
             <w:r>
               <w:rPr>
-                <w:rFonts w:ascii="Calibri" w:hAnsi="Calibri" w:eastAsia="Calibri"/>
+                <w:rFonts w:ascii="Calibri" w:hAnsi="Calibri"/>
                 <w:b/>
                 <w:i w:val="0"/>
                 <w:color w:val="00224B"/>
@@ -422,7 +422,7 @@
             <w:r/>
             <w:r>
               <w:rPr>
-                <w:rFonts w:ascii="Calibri" w:hAnsi="Calibri" w:eastAsia="Calibri"/>
+                <w:rFonts w:ascii="Calibri" w:hAnsi="Calibri"/>
                 <w:b w:val="0"/>
                 <w:i w:val="0"/>
                 <w:color w:val="000000"/>
@@ -441,7 +441,7 @@
       </w:pPr>
       <w:r>
         <w:rPr>
-          <w:rFonts w:ascii="Calibri" w:hAnsi="Calibri" w:eastAsia="Calibri"/>
+          <w:rFonts w:ascii="Calibri" w:hAnsi="Calibri"/>
           <w:b/>
           <w:i w:val="0"/>
           <w:color w:val="E36C09"/>
@@ -457,7 +457,7 @@
       </w:pPr>
       <w:r>
         <w:rPr>
-          <w:rFonts w:ascii="Calibri" w:hAnsi="Calibri" w:eastAsia="Calibri"/>
+          <w:rFonts w:ascii="Calibri" w:hAnsi="Calibri"/>
           <w:b/>
           <w:i w:val="0"/>
           <w:color w:val="E36C09"/>
@@ -469,7 +469,6 @@
     <w:tbl>
       <w:tblPr>
         <w:tblW w:type="auto" w:w="0"/>
-        <w:jc w:val="center"/>
         <w:tblLook w:firstColumn="1" w:firstRow="1" w:lastColumn="0" w:lastRow="0" w:noHBand="0" w:noVBand="1" w:val="04A0"/>
         <w:tblBorders>
           <w:top w:val="single" w:sz="8" w:color="000000" w:space="0"/>
@@ -498,7 +497,7 @@
             <w:r/>
             <w:r>
               <w:rPr>
-                <w:rFonts w:ascii="Calibri" w:hAnsi="Calibri" w:eastAsia="Calibri"/>
+                <w:rFonts w:ascii="Calibri" w:hAnsi="Calibri"/>
                 <w:b/>
                 <w:i w:val="0"/>
                 <w:color w:val="FFFFFF"/>
@@ -521,7 +520,7 @@
             <w:r/>
             <w:r>
               <w:rPr>
-                <w:rFonts w:ascii="Calibri" w:hAnsi="Calibri" w:eastAsia="Calibri"/>
+                <w:rFonts w:ascii="Calibri" w:hAnsi="Calibri"/>
                 <w:b/>
                 <w:i w:val="0"/>
                 <w:color w:val="FFFFFF"/>
@@ -544,7 +543,7 @@
             <w:r/>
             <w:r>
               <w:rPr>
-                <w:rFonts w:ascii="Calibri" w:hAnsi="Calibri" w:eastAsia="Calibri"/>
+                <w:rFonts w:ascii="Calibri" w:hAnsi="Calibri"/>
                 <w:b w:val="0"/>
                 <w:i w:val="0"/>
                 <w:color w:val="000000"/>
@@ -566,7 +565,7 @@
             <w:r/>
             <w:r>
               <w:rPr>
-                <w:rFonts w:ascii="Calibri" w:hAnsi="Calibri" w:eastAsia="Calibri"/>
+                <w:rFonts w:ascii="Calibri" w:hAnsi="Calibri"/>
                 <w:b w:val="0"/>
                 <w:i w:val="0"/>
                 <w:color w:val="000000"/>
@@ -589,7 +588,7 @@
             <w:r/>
             <w:r>
               <w:rPr>
-                <w:rFonts w:ascii="Calibri" w:hAnsi="Calibri" w:eastAsia="Calibri"/>
+                <w:rFonts w:ascii="Calibri" w:hAnsi="Calibri"/>
                 <w:b w:val="0"/>
                 <w:i w:val="0"/>
                 <w:color w:val="000000"/>
@@ -611,7 +610,7 @@
             <w:r/>
             <w:r>
               <w:rPr>
-                <w:rFonts w:ascii="Calibri" w:hAnsi="Calibri" w:eastAsia="Calibri"/>
+                <w:rFonts w:ascii="Calibri" w:hAnsi="Calibri"/>
                 <w:b w:val="0"/>
                 <w:i w:val="0"/>
                 <w:color w:val="000000"/>
@@ -634,7 +633,7 @@
             <w:r/>
             <w:r>
               <w:rPr>
-                <w:rFonts w:ascii="Calibri" w:hAnsi="Calibri" w:eastAsia="Calibri"/>
+                <w:rFonts w:ascii="Calibri" w:hAnsi="Calibri"/>
                 <w:b w:val="0"/>
                 <w:i w:val="0"/>
                 <w:color w:val="000000"/>
@@ -656,7 +655,7 @@
             <w:r/>
             <w:r>
               <w:rPr>
-                <w:rFonts w:ascii="Calibri" w:hAnsi="Calibri" w:eastAsia="Calibri"/>
+                <w:rFonts w:ascii="Calibri" w:hAnsi="Calibri"/>
                 <w:b w:val="0"/>
                 <w:i w:val="0"/>
                 <w:color w:val="000000"/>
@@ -679,13 +678,13 @@
             <w:r/>
             <w:r>
               <w:rPr>
-                <w:rFonts w:ascii="Calibri" w:hAnsi="Calibri" w:eastAsia="Calibri"/>
+                <w:rFonts w:ascii="Calibri" w:hAnsi="Calibri"/>
                 <w:b w:val="0"/>
                 <w:i w:val="0"/>
                 <w:color w:val="000000"/>
                 <w:sz w:val="22"/>
               </w:rPr>
-              <w:t>Maintenance 1 an (sécurité, mises à jour, support Django)</w:t>
+              <w:t>Hébergement et accompagnement deux ans (VPS, sécurité, mises à jour, support)</w:t>
             </w:r>
           </w:p>
         </w:tc>
@@ -701,13 +700,13 @@
             <w:r/>
             <w:r>
               <w:rPr>
-                <w:rFonts w:ascii="Calibri" w:hAnsi="Calibri" w:eastAsia="Calibri"/>
+                <w:rFonts w:ascii="Calibri" w:hAnsi="Calibri"/>
                 <w:b w:val="0"/>
                 <w:i w:val="0"/>
                 <w:color w:val="000000"/>
                 <w:sz w:val="22"/>
               </w:rPr>
-              <w:t>350 000</w:t>
+              <w:t>2 000 000</w:t>
             </w:r>
           </w:p>
         </w:tc>
@@ -724,13 +723,13 @@
             <w:r/>
             <w:r>
               <w:rPr>
-                <w:rFonts w:ascii="Calibri" w:hAnsi="Calibri" w:eastAsia="Calibri"/>
-                <w:b w:val="0"/>
+                <w:rFonts w:ascii="Calibri" w:hAnsi="Calibri"/>
+                <w:b/>
                 <w:i w:val="0"/>
                 <w:color w:val="000000"/>
                 <w:sz w:val="22"/>
               </w:rPr>
-              <w:t>Hébergement &amp; déploiement Django (VPS) 1 an</w:t>
+              <w:t>TOTAL TTC</w:t>
             </w:r>
           </w:p>
         </w:tc>
@@ -746,58 +745,13 @@
             <w:r/>
             <w:r>
               <w:rPr>
-                <w:rFonts w:ascii="Calibri" w:hAnsi="Calibri" w:eastAsia="Calibri"/>
-                <w:b w:val="0"/>
-                <w:i w:val="0"/>
-                <w:color w:val="000000"/>
-                <w:sz w:val="22"/>
-              </w:rPr>
-              <w:t>150 000</w:t>
-            </w:r>
-          </w:p>
-        </w:tc>
-      </w:tr>
-      <w:tr>
-        <w:tc>
-          <w:tcPr>
-            <w:tcW w:type="dxa" w:w="7257"/>
-          </w:tcPr>
-          <w:p>
-            <w:pPr>
-              <w:spacing w:before="100" w:after="100"/>
-            </w:pPr>
-            <w:r/>
-            <w:r>
-              <w:rPr>
-                <w:rFonts w:ascii="Calibri" w:hAnsi="Calibri" w:eastAsia="Calibri"/>
+                <w:rFonts w:ascii="Calibri" w:hAnsi="Calibri"/>
                 <w:b/>
                 <w:i w:val="0"/>
                 <w:color w:val="000000"/>
                 <w:sz w:val="22"/>
               </w:rPr>
-              <w:t>TOTAL</w:t>
-            </w:r>
-          </w:p>
-        </w:tc>
-        <w:tc>
-          <w:tcPr>
-            <w:tcW w:type="dxa" w:w="2835"/>
-          </w:tcPr>
-          <w:p>
-            <w:pPr>
-              <w:spacing w:before="100" w:after="100"/>
-              <w:jc w:val="right"/>
-            </w:pPr>
-            <w:r/>
-            <w:r>
-              <w:rPr>
-                <w:rFonts w:ascii="Calibri" w:hAnsi="Calibri" w:eastAsia="Calibri"/>
-                <w:b/>
-                <w:i w:val="0"/>
-                <w:color w:val="000000"/>
-                <w:sz w:val="22"/>
-              </w:rPr>
-              <w:t>4 150 000</w:t>
+              <w:t>5 650 000</w:t>
             </w:r>
           </w:p>
         </w:tc>
@@ -837,7 +791,7 @@
             <w:r/>
             <w:r>
               <w:rPr>
-                <w:rFonts w:ascii="Calibri" w:hAnsi="Calibri" w:eastAsia="Calibri"/>
+                <w:rFonts w:ascii="Calibri" w:hAnsi="Calibri"/>
                 <w:b/>
                 <w:i w:val="0"/>
                 <w:color w:val="000000"/>
@@ -858,13 +812,13 @@
             <w:r/>
             <w:r>
               <w:rPr>
-                <w:rFonts w:ascii="Calibri" w:hAnsi="Calibri" w:eastAsia="Calibri"/>
+                <w:rFonts w:ascii="Calibri" w:hAnsi="Calibri"/>
                 <w:b w:val="0"/>
                 <w:i w:val="0"/>
                 <w:color w:val="000000"/>
                 <w:sz w:val="24"/>
               </w:rPr>
-              <w:t xml:space="preserve">          4 150 000</w:t>
+              <w:t xml:space="preserve">          5 650 000</w:t>
             </w:r>
           </w:p>
         </w:tc>
@@ -881,7 +835,7 @@
             <w:r/>
             <w:r>
               <w:rPr>
-                <w:rFonts w:ascii="Calibri" w:hAnsi="Calibri" w:eastAsia="Calibri"/>
+                <w:rFonts w:ascii="Calibri" w:hAnsi="Calibri"/>
                 <w:b/>
                 <w:i w:val="0"/>
                 <w:color w:val="000000"/>
@@ -902,13 +856,13 @@
             <w:r/>
             <w:r>
               <w:rPr>
-                <w:rFonts w:ascii="Calibri" w:hAnsi="Calibri" w:eastAsia="Calibri"/>
+                <w:rFonts w:ascii="Calibri" w:hAnsi="Calibri"/>
                 <w:b w:val="0"/>
                 <w:i w:val="0"/>
                 <w:color w:val="000000"/>
                 <w:sz w:val="24"/>
               </w:rPr>
-              <w:t xml:space="preserve">          83 000</w:t>
+              <w:t xml:space="preserve">          113 000</w:t>
             </w:r>
           </w:p>
         </w:tc>
@@ -925,13 +879,13 @@
             <w:r/>
             <w:r>
               <w:rPr>
-                <w:rFonts w:ascii="Calibri" w:hAnsi="Calibri" w:eastAsia="Calibri"/>
+                <w:rFonts w:ascii="Calibri" w:hAnsi="Calibri"/>
                 <w:b/>
                 <w:i w:val="0"/>
                 <w:color w:val="000000"/>
                 <w:sz w:val="24"/>
               </w:rPr>
-              <w:t>Net à payer :</w:t>
+              <w:t>Net à payer TTC :</w:t>
             </w:r>
           </w:p>
         </w:tc>
@@ -946,13 +900,13 @@
             <w:r/>
             <w:r>
               <w:rPr>
-                <w:rFonts w:ascii="Calibri" w:hAnsi="Calibri" w:eastAsia="Calibri"/>
+                <w:rFonts w:ascii="Calibri" w:hAnsi="Calibri"/>
                 <w:b/>
                 <w:i w:val="0"/>
                 <w:color w:val="000000"/>
                 <w:sz w:val="24"/>
               </w:rPr>
-              <w:t xml:space="preserve">          4 150 000</w:t>
+              <w:t xml:space="preserve">          5 650 000</w:t>
             </w:r>
           </w:p>
         </w:tc>
@@ -960,17 +914,32 @@
     </w:tbl>
     <w:p>
       <w:pPr>
-        <w:spacing w:before="240" w:after="200"/>
+        <w:spacing w:before="240" w:after="120"/>
       </w:pPr>
       <w:r>
         <w:rPr>
-          <w:rFonts w:ascii="Arial" w:hAnsi="Arial" w:eastAsia="Arial"/>
+          <w:rFonts w:ascii="Arial" w:hAnsi="Arial"/>
           <w:b w:val="0"/>
           <w:i w:val="0"/>
           <w:color w:val="000000"/>
           <w:sz w:val="20"/>
         </w:rPr>
-        <w:t>Arrêtée la présente facture proforma à la somme de quatre millions cent cinquante mille (4 150 000) francs CFA, ce prix inclut l’ISB (2%) qui sera prélevé à la source.</w:t>
+        <w:t>Arrêtée la présente facture proforma à la somme de cinq millions six cent cinquante mille (5 650 000) francs CFA TTC, ce prix inclut l’ISB (2%) qui sera prélevé à la source.</w:t>
+      </w:r>
+    </w:p>
+    <w:p>
+      <w:pPr>
+        <w:spacing w:before="0" w:after="200"/>
+      </w:pPr>
+      <w:r>
+        <w:rPr>
+          <w:rFonts w:ascii="Arial" w:hAnsi="Arial"/>
+          <w:b/>
+          <w:i w:val="0"/>
+          <w:color w:val="000000"/>
+          <w:sz w:val="20"/>
+        </w:rPr>
+        <w:t>Dont hébergement et accompagnement deux ans : 2 000 000 FCFA TTC.</w:t>
       </w:r>
     </w:p>
     <w:p>
@@ -979,7 +948,7 @@
       </w:pPr>
       <w:r>
         <w:rPr>
-          <w:rFonts w:ascii="Calibri" w:hAnsi="Calibri" w:eastAsia="Calibri"/>
+          <w:rFonts w:ascii="Calibri" w:hAnsi="Calibri"/>
           <w:b/>
           <w:i w:val="0"/>
           <w:color w:val="000000"/>
@@ -1020,7 +989,7 @@
             <w:r/>
             <w:r>
               <w:rPr>
-                <w:rFonts w:ascii="Calibri" w:hAnsi="Calibri" w:eastAsia="Calibri"/>
+                <w:rFonts w:ascii="Calibri" w:hAnsi="Calibri"/>
                 <w:b w:val="0"/>
                 <w:i w:val="0"/>
                 <w:color w:val="000000"/>
@@ -1042,7 +1011,7 @@
             <w:r/>
             <w:r>
               <w:rPr>
-                <w:rFonts w:ascii="Calibri" w:hAnsi="Calibri" w:eastAsia="Calibri"/>
+                <w:rFonts w:ascii="Calibri" w:hAnsi="Calibri"/>
                 <w:b w:val="0"/>
                 <w:i w:val="0"/>
                 <w:color w:val="000000"/>
@@ -1064,7 +1033,7 @@
             <w:r/>
             <w:r>
               <w:rPr>
-                <w:rFonts w:ascii="Calibri" w:hAnsi="Calibri" w:eastAsia="Calibri"/>
+                <w:rFonts w:ascii="Calibri" w:hAnsi="Calibri"/>
                 <w:b w:val="0"/>
                 <w:i w:val="0"/>
                 <w:color w:val="000000"/>
@@ -1086,7 +1055,7 @@
             <w:r/>
             <w:r>
               <w:rPr>
-                <w:rFonts w:ascii="Calibri" w:hAnsi="Calibri" w:eastAsia="Calibri"/>
+                <w:rFonts w:ascii="Calibri" w:hAnsi="Calibri"/>
                 <w:b w:val="0"/>
                 <w:i w:val="0"/>
                 <w:color w:val="000000"/>
@@ -1110,7 +1079,7 @@
             <w:r/>
             <w:r>
               <w:rPr>
-                <w:rFonts w:ascii="Calibri" w:hAnsi="Calibri" w:eastAsia="Calibri"/>
+                <w:rFonts w:ascii="Calibri" w:hAnsi="Calibri"/>
                 <w:b w:val="0"/>
                 <w:i w:val="0"/>
                 <w:color w:val="000000"/>
@@ -1132,7 +1101,7 @@
             <w:r/>
             <w:r>
               <w:rPr>
-                <w:rFonts w:ascii="Calibri" w:hAnsi="Calibri" w:eastAsia="Calibri"/>
+                <w:rFonts w:ascii="Calibri" w:hAnsi="Calibri"/>
                 <w:b w:val="0"/>
                 <w:i w:val="0"/>
                 <w:color w:val="000000"/>
@@ -1154,7 +1123,7 @@
             <w:r/>
             <w:r>
               <w:rPr>
-                <w:rFonts w:ascii="Calibri" w:hAnsi="Calibri" w:eastAsia="Calibri"/>
+                <w:rFonts w:ascii="Calibri" w:hAnsi="Calibri"/>
                 <w:b w:val="0"/>
                 <w:i w:val="0"/>
                 <w:color w:val="000000"/>
@@ -1176,7 +1145,7 @@
             <w:r/>
             <w:r>
               <w:rPr>
-                <w:rFonts w:ascii="Calibri" w:hAnsi="Calibri" w:eastAsia="Calibri"/>
+                <w:rFonts w:ascii="Calibri" w:hAnsi="Calibri"/>
                 <w:b w:val="0"/>
                 <w:i w:val="0"/>
                 <w:color w:val="000000"/>
@@ -1194,7 +1163,7 @@
       </w:pPr>
       <w:r>
         <w:rPr>
-          <w:rFonts w:ascii="Arial" w:hAnsi="Arial" w:eastAsia="Arial"/>
+          <w:rFonts w:ascii="Arial" w:hAnsi="Arial"/>
           <w:b w:val="0"/>
           <w:i w:val="0"/>
           <w:color w:val="444444"/>

</xml_diff>

<commit_message>
Plafonne la proforma ML CONSULTING à 2 000 000 FCFA TTC
Redistribue les postes (Django, modules, e-mails, hébergement
et accompagnement 2 ans) pour un total net TTC de 2 000 000 FCFA.

Co-authored-by: NigerCertify-offensive-lab <openaiabou@gmail.com>
</commit_message>
<xml_diff>
--- a/offres/facture-proforma-ml-consulting.docx
+++ b/offres/facture-proforma-ml-consulting.docx
@@ -571,7 +571,7 @@
                 <w:color w:val="000000"/>
                 <w:sz w:val="22"/>
               </w:rPr>
-              <w:t>2 800 000</w:t>
+              <w:t>1 100 000</w:t>
             </w:r>
           </w:p>
         </w:tc>
@@ -616,7 +616,7 @@
                 <w:color w:val="000000"/>
                 <w:sz w:val="22"/>
               </w:rPr>
-              <w:t>750 000</w:t>
+              <w:t>350 000</w:t>
             </w:r>
           </w:p>
         </w:tc>
@@ -661,7 +661,7 @@
                 <w:color w:val="000000"/>
                 <w:sz w:val="22"/>
               </w:rPr>
-              <w:t>100 000</w:t>
+              <w:t>50 000</w:t>
             </w:r>
           </w:p>
         </w:tc>
@@ -706,7 +706,7 @@
                 <w:color w:val="000000"/>
                 <w:sz w:val="22"/>
               </w:rPr>
-              <w:t>2 000 000</w:t>
+              <w:t>500 000</w:t>
             </w:r>
           </w:p>
         </w:tc>
@@ -751,7 +751,7 @@
                 <w:color w:val="000000"/>
                 <w:sz w:val="22"/>
               </w:rPr>
-              <w:t>5 650 000</w:t>
+              <w:t>2 000 000</w:t>
             </w:r>
           </w:p>
         </w:tc>
@@ -818,7 +818,7 @@
                 <w:color w:val="000000"/>
                 <w:sz w:val="24"/>
               </w:rPr>
-              <w:t xml:space="preserve">          5 650 000</w:t>
+              <w:t xml:space="preserve">          2 000 000</w:t>
             </w:r>
           </w:p>
         </w:tc>
@@ -862,7 +862,7 @@
                 <w:color w:val="000000"/>
                 <w:sz w:val="24"/>
               </w:rPr>
-              <w:t xml:space="preserve">          113 000</w:t>
+              <w:t xml:space="preserve">          40 000</w:t>
             </w:r>
           </w:p>
         </w:tc>
@@ -906,7 +906,7 @@
                 <w:color w:val="000000"/>
                 <w:sz w:val="24"/>
               </w:rPr>
-              <w:t xml:space="preserve">          5 650 000</w:t>
+              <w:t xml:space="preserve">          2 000 000</w:t>
             </w:r>
           </w:p>
         </w:tc>
@@ -924,7 +924,7 @@
           <w:color w:val="000000"/>
           <w:sz w:val="20"/>
         </w:rPr>
-        <w:t>Arrêtée la présente facture proforma à la somme de cinq millions six cent cinquante mille (5 650 000) francs CFA TTC, ce prix inclut l’ISB (2%) qui sera prélevé à la source.</w:t>
+        <w:t>Arrêtée la présente facture proforma à la somme de deux millions (2 000 000) francs CFA TTC, ce prix inclut l’ISB (2%) qui sera prélevé à la source.</w:t>
       </w:r>
     </w:p>
     <w:p>
@@ -939,7 +939,7 @@
           <w:color w:val="000000"/>
           <w:sz w:val="20"/>
         </w:rPr>
-        <w:t>Dont hébergement et accompagnement deux ans : 2 000 000 FCFA TTC.</w:t>
+        <w:t>Dont hébergement et accompagnement deux ans : 500 000 FCFA TTC.</w:t>
       </w:r>
     </w:p>
     <w:p>
@@ -1299,7 +1299,6 @@
   <w:p>
     <w:pPr>
       <w:pStyle w:val="Footer"/>
-      <w:jc w:val="left"/>
     </w:pPr>
   </w:p>
   <w:tbl>

</xml_diff>